<commit_message>
Use plain first-person 我 instead of 筆者 in the Chinese manuscript
</commit_message>
<xml_diff>
--- a/paper/tact_zh.docx
+++ b/paper/tact_zh.docx
@@ -538,7 +538,7 @@
         <w:rPr>
           <w:rFonts w:hint="eastAsia"/>
         </w:rPr>
-        <w:t xml:space="preserve">然而這類改良存在一項結構性弱點，就筆者所知尚無已發表方法處理。現有加權方案，包括</w:t>
+        <w:t xml:space="preserve">然而這類改良存在一項結構性弱點，就我所知尚無已發表方法處理。現有加權方案，包括</w:t>
       </w:r>
       <w:r>
         <w:t xml:space="preserve"> CISC </w:t>
@@ -1691,16 +1691,16 @@
         <w:rPr>
           <w:rFonts w:hint="eastAsia"/>
         </w:rPr>
-        <w:t xml:space="preserve">筆者先前提出的系統</w:t>
-      </w:r>
-      <w:r>
-        <w:t xml:space="preserve"> </w:t>
-      </w:r>
-      <w:r>
-        <w:rPr>
-          <w:rFonts w:hint="eastAsia"/>
-        </w:rPr>
-        <w:t xml:space="preserve">RLEV-VoI（冗餘折扣投票搭配資訊價值停止準則）曾以相同的證偽紀律評估，結果未能通過：一個簡單的去重基線在所有情境全面勝出，因此筆者將該系統以負面結果發表。正是在分析那次失敗的過程中，筆者注意到了本文所研究的信心兩難。</w:t>
+        <w:t xml:space="preserve">我先前提出的系統</w:t>
+      </w:r>
+      <w:r>
+        <w:t xml:space="preserve"> </w:t>
+      </w:r>
+      <w:r>
+        <w:rPr>
+          <w:rFonts w:hint="eastAsia"/>
+        </w:rPr>
+        <w:t xml:space="preserve">RLEV-VoI（冗餘折扣投票搭配資訊價值停止準則）曾以相同的證偽紀律評估，結果未能通過：一個簡單的去重基線在所有情境全面勝出，因此我將該系統以負面結果發表。正是在分析那次失敗的過程中，我注意到了本文所研究的信心兩難。</w:t>
       </w:r>
     </w:p>
     <w:bookmarkEnd w:id="11"/>
@@ -8151,7 +8151,7 @@
         <w:rPr>
           <w:rFonts w:hint="eastAsia"/>
         </w:rPr>
-        <w:t xml:space="preserve">是否最高」，則所有良性的負相關通道都會誤觸發。這個缺陷是筆者在開發過程中實際遭遇、診斷並修正的，相關行為已由公開測試固定。最後，顯著性閘門作用於原始統計量</w:t>
+        <w:t xml:space="preserve">是否最高」，則所有良性的負相關通道都會誤觸發。這個缺陷是我在開發過程中實際遭遇、診斷並修正的，相關行為已由公開測試固定。最後，顯著性閘門作用於原始統計量</w:t>
       </w:r>
       <w:r>
         <w:t xml:space="preserve"> </w:t>
@@ -13885,7 +13885,7 @@
         <w:rPr>
           <w:rFonts w:hint="eastAsia"/>
         </w:rPr>
-        <w:t xml:space="preserve">CISC。本文證明了長期無法在此類方法中表達的「符號」，可以在明確陳述並經測試的條件下以零標籤恢復。隨附的不可能性結果為未來的逐題方法劃出必須尊重的界線；而這套曾經否決筆者自己先前系統的證偽協定，或許是本文最具可攜性的貢獻。</w:t>
+        <w:t xml:space="preserve">CISC。本文證明了長期無法在此類方法中表達的「符號」，可以在明確陳述並經測試的條件下以零標籤恢復。隨附的不可能性結果為未來的逐題方法劃出必須尊重的界線；而這套曾經否決我自己先前系統的證偽協定，或許是本文最具可攜性的貢獻。</w:t>
       </w:r>
     </w:p>
     <w:bookmarkEnd w:id="46"/>

</xml_diff>

<commit_message>
Clean translation-ese out of the Chinese edition
Seven sites, all introduced by translating from the English source:

- 通過 used for "via the link" where it means "pass a test" in Taiwanese
  usage (2 sites). The other 15 occurrences are the correct sense -- passing
  a gate, a falsifier, a reference solution -- and stay.
- 實現標準差 for "realized SD" does not parse; 實測標準差 does.
- 實現的基質 for "the realized substrate" is translation-ese.
- 集成 for "ensemble" collides with the integrated-circuit sense in Taiwan;
  said plainly instead.
- 對每題進行 R=20 次… is a nominalised verb inside a redundant frame.
- A stray 最後， that the sentence does not need.
- One half-width comma inside a Chinese phrase.

Left alone deliberately: the 21 uses of 其. This is a paper, so the formal
register is correct and the colloquialisation rules do not apply. 答案代碼 is
also correct Taiwanese for an identifier code, not source code.
</commit_message>
<xml_diff>
--- a/paper/tact_zh.docx
+++ b/paper/tact_zh.docx
@@ -143,7 +143,7 @@
         <w:rPr>
           <w:rFonts w:hint="eastAsia"/>
         </w:rPr>
-        <w:t xml:space="preserve">收縮，再通過</w:t>
+        <w:t xml:space="preserve">收縮，再經</w:t>
       </w:r>
       <w:r>
         <w:t xml:space="preserve"> Bayes </w:t>
@@ -1080,7 +1080,7 @@
         <w:rPr>
           <w:rFonts w:hint="eastAsia"/>
         </w:rPr>
-        <w:t xml:space="preserve">收縮，最後通過含混合變異數校正的</w:t>
+        <w:t xml:space="preserve">收縮，最後經含混合變異數校正的</w:t>
       </w:r>
       <w:r>
         <w:t xml:space="preserve"> Bayes </w:t>
@@ -2006,7 +2006,7 @@
         <w:rPr>
           <w:rFonts w:hint="eastAsia"/>
         </w:rPr>
-        <w:t xml:space="preserve">與近期的</w:t>
+        <w:t xml:space="preserve">與近期結合多個</w:t>
       </w:r>
       <w:r>
         <w:t xml:space="preserve"> LLM </w:t>
@@ -2015,7 +2015,7 @@
         <w:rPr>
           <w:rFonts w:hint="eastAsia"/>
         </w:rPr>
-        <w:t xml:space="preserve">集成研究</w:t>
+        <w:t xml:space="preserve">的研究</w:t>
       </w:r>
       <w:r>
         <w:t xml:space="preserve"> </w:t>
@@ -3706,7 +3706,7 @@
         <w:rPr>
           <w:rFonts w:hint="eastAsia"/>
         </w:rPr>
-        <w:t xml:space="preserve">在題內的實現標準差。此處不可改用閉式常數：無同分時</w:t>
+        <w:t xml:space="preserve">在題內的實測標準差。此處不可改用閉式常數：無同分時</w:t>
       </w:r>
       <w:r>
         <w:t xml:space="preserve"> </w:t>
@@ -9264,7 +9264,7 @@
         <w:rPr>
           <w:rFonts w:hint="eastAsia"/>
         </w:rPr>
-        <w:t xml:space="preserve">對每題進行</w:t>
+        <w:t xml:space="preserve">每題做</w:t>
       </w:r>
       <w:r>
         <w:t xml:space="preserve"> </w:t>
@@ -9290,7 +9290,7 @@
         <w:rPr>
           <w:rFonts w:hint="eastAsia"/>
         </w:rPr>
-        <w:t xml:space="preserve">次隨機對半分割並計算兩半多數決的一致率</w:t>
+        <w:t xml:space="preserve">次隨機對半分割，計算兩半多數決的一致率</w:t>
       </w:r>
       <w:r>
         <w:t xml:space="preserve"> </w:t>
@@ -9712,7 +9712,7 @@
         <w:rPr>
           <w:rFonts w:hint="eastAsia"/>
         </w:rPr>
-        <w:t xml:space="preserve">是否最高」，則所有良性的負相關通道都會誤觸發。這個缺陷是開發過程中實際遭遇、診斷並修正的，相關行為已由公開測試固定。最後，顯著性閘門作用於原始統計量</w:t>
+        <w:t xml:space="preserve">是否最高」，則所有良性的負相關通道都會誤觸發。這個缺陷是開發過程中實際遭遇、診斷並修正的，相關行為已由公開測試固定。顯著性閘門作用於原始統計量</w:t>
       </w:r>
       <w:r>
         <w:t xml:space="preserve"> </w:t>
@@ -19485,7 +19485,7 @@
         <w:rPr>
           <w:rFonts w:hint="eastAsia"/>
         </w:rPr>
-        <w:t xml:space="preserve">實現的基質再次飽和：每軌跡準確率</w:t>
+        <w:t xml:space="preserve">實際跑出來的基質再次飽和：每軌跡準確率</w:t>
       </w:r>
       <w:r>
         <w:t xml:space="preserve"> </w:t>
@@ -22670,16 +22670,7 @@
         <w:rPr>
           <w:rFonts w:hint="eastAsia"/>
         </w:rPr>
-        <w:t xml:space="preserve">題目上出錯、而正解仍在可及範圍的（模型,</w:t>
-      </w:r>
-      <w:r>
-        <w:t xml:space="preserve"> </w:t>
-      </w:r>
-      <w:r>
-        <w:rPr>
-          <w:rFonts w:hint="eastAsia"/>
-        </w:rPr>
-        <w:t xml:space="preserve">基準）組合；本文試過的組合沒有一組同時滿足這兩個條件。至於「窗口只在外部錨便宜的地方才變寬」這個看似合理的假設，8.9</w:t>
+        <w:t xml:space="preserve">題目上出錯、而正解仍在可及範圍的（模型、基準）組合；本文試過的組合沒有一組同時滿足這兩個條件。至於「窗口只在外部錨便宜的地方才變寬」這個看似合理的假設，8.9</w:t>
       </w:r>
       <w:r>
         <w:t xml:space="preserve"> </w:t>

</xml_diff>